<commit_message>
Cập nhật báo cáo tuần 4
</commit_message>
<xml_diff>
--- a/BaoCaoTuan1.docx
+++ b/BaoCaoTuan1.docx
@@ -24,7 +24,7 @@
         </w:numPr>
       </w:pPr>
       <w:r>
-        <w:t>Đã đăng ký dataset name là</w:t>
+        <w:t>Chọn Đề Tài</w:t>
       </w:r>
     </w:p>
     <w:p>
@@ -36,12 +36,7 @@
         </w:numPr>
       </w:pPr>
       <w:r>
-        <w:t>Làm sạch dữ liệu và lưu lại file csv</w:t>
-      </w:r>
-    </w:p>
-    <w:p>
-      <w:r>
-        <w:t>TUẦN 2:</w:t>
+        <w:t xml:space="preserve">Đã đăng ký dataset name </w:t>
       </w:r>
     </w:p>
     <w:p>
@@ -53,7 +48,126 @@
         </w:numPr>
       </w:pPr>
       <w:r>
-        <w:t>Viết code đã đọc được file csv và đư avaof hiệu thống dạng cấu trúc dữ liệu là cây AVL</w:t>
+        <w:t>Làm sạch dữ liệu và lưu lại file csv</w:t>
+      </w:r>
+    </w:p>
+    <w:p>
+      <w:pPr>
+        <w:pStyle w:val="ListParagraph"/>
+        <w:numPr>
+          <w:ilvl w:val="0"/>
+          <w:numId w:val="1"/>
+        </w:numPr>
+      </w:pPr>
+      <w:r>
+        <w:t>Chọn công nghệ thực hiện đề tài:Laravel,wamp</w:t>
+      </w:r>
+    </w:p>
+    <w:p>
+      <w:pPr>
+        <w:pStyle w:val="ListParagraph"/>
+      </w:pPr>
+    </w:p>
+    <w:p>
+      <w:r>
+        <w:t>TUẦN 2:</w:t>
+      </w:r>
+    </w:p>
+    <w:p>
+      <w:pPr>
+        <w:pStyle w:val="ListParagraph"/>
+        <w:numPr>
+          <w:ilvl w:val="0"/>
+          <w:numId w:val="1"/>
+        </w:numPr>
+      </w:pPr>
+      <w:r>
+        <w:t xml:space="preserve">Tìm hiểu sơ đồ </w:t>
+      </w:r>
+    </w:p>
+    <w:p>
+      <w:pPr>
+        <w:pStyle w:val="ListParagraph"/>
+        <w:numPr>
+          <w:ilvl w:val="0"/>
+          <w:numId w:val="1"/>
+        </w:numPr>
+      </w:pPr>
+      <w:r>
+        <w:t>Tải git bash, tìm hiểu cách sử dụng Git</w:t>
+      </w:r>
+    </w:p>
+    <w:p>
+      <w:pPr>
+        <w:pStyle w:val="ListParagraph"/>
+        <w:numPr>
+          <w:ilvl w:val="0"/>
+          <w:numId w:val="1"/>
+        </w:numPr>
+      </w:pPr>
+      <w:r>
+        <w:t xml:space="preserve">Tạo được repo trong Git </w:t>
+      </w:r>
+    </w:p>
+    <w:p>
+      <w:r>
+        <w:t xml:space="preserve">TUẦN </w:t>
+      </w:r>
+      <w:r>
+        <w:t>3</w:t>
+      </w:r>
+      <w:r>
+        <w:t>:</w:t>
+      </w:r>
+    </w:p>
+    <w:p>
+      <w:pPr>
+        <w:pStyle w:val="ListParagraph"/>
+        <w:numPr>
+          <w:ilvl w:val="0"/>
+          <w:numId w:val="1"/>
+        </w:numPr>
+      </w:pPr>
+      <w:r>
+        <w:t>Làm xong layout của chủ đề</w:t>
+      </w:r>
+    </w:p>
+    <w:p>
+      <w:r>
+        <w:t xml:space="preserve">TUẦN </w:t>
+      </w:r>
+      <w:r>
+        <w:t>4</w:t>
+      </w:r>
+      <w:r>
+        <w:t>:</w:t>
+      </w:r>
+    </w:p>
+    <w:p>
+      <w:pPr>
+        <w:pStyle w:val="ListParagraph"/>
+        <w:numPr>
+          <w:ilvl w:val="0"/>
+          <w:numId w:val="1"/>
+        </w:numPr>
+      </w:pPr>
+      <w:r>
+        <w:t xml:space="preserve">Làm </w:t>
+      </w:r>
+      <w:r>
+        <w:t>layout cho admin</w:t>
+      </w:r>
+    </w:p>
+    <w:p>
+      <w:pPr>
+        <w:pStyle w:val="ListParagraph"/>
+        <w:numPr>
+          <w:ilvl w:val="0"/>
+          <w:numId w:val="1"/>
+        </w:numPr>
+      </w:pPr>
+      <w:r>
+        <w:t>Thêm Category, Product</w:t>
       </w:r>
     </w:p>
     <w:sectPr>

</xml_diff>